<commit_message>
Convenzione (scheda condivisa e docx): tipo delle residenze da decidere, medici IndividualPhysician
Co-Authored-By: Claude Opus 5.5 <noreply@anthropic.com>
Claude-Session: https://claude.ai/code/session_01Rr1X44gsg7BUwMzrRvYrc2
</commit_message>
<xml_diff>
--- a/docs/docx/convenzione-identificativi.docx
+++ b/docs/docx/convenzione-identificativi.docx
@@ -345,9 +345,9 @@
       </w:tblPr>
       <w:tblGrid>
         <w:gridCol w:w="1669"/>
-        <w:gridCol w:w="1916"/>
         <w:gridCol w:w="2340"/>
-        <w:gridCol w:w="3435"/>
+        <w:gridCol w:w="2340"/>
+        <w:gridCol w:w="3011"/>
       </w:tblGrid>
       <w:tr>
         <w:trPr>
@@ -367,7 +367,7 @@
         </w:tc>
         <w:tc>
           <w:tcPr>
-            <w:tcW w:w="1916" w:type="dxa"/>
+            <w:tcW w:w="2340" w:type="dxa"/>
             <w:shd w:val="clear" w:color="auto" w:fill="F2F2F2"/>
           </w:tcPr>
           <w:p>
@@ -394,7 +394,7 @@
         </w:tc>
         <w:tc>
           <w:tcPr>
-            <w:tcW w:w="3435" w:type="dxa"/>
+            <w:tcW w:w="3011" w:type="dxa"/>
             <w:shd w:val="clear" w:color="auto" w:fill="F2F2F2"/>
           </w:tcPr>
           <w:p>
@@ -419,7 +419,7 @@
         </w:tc>
         <w:tc>
           <w:tcPr>
-            <w:tcW w:w="1916" w:type="dxa"/>
+            <w:tcW w:w="2340" w:type="dxa"/>
           </w:tcPr>
           <w:p>
             <w:pPr/>
@@ -447,7 +447,7 @@
         </w:tc>
         <w:tc>
           <w:tcPr>
-            <w:tcW w:w="3435" w:type="dxa"/>
+            <w:tcW w:w="3011" w:type="dxa"/>
           </w:tcPr>
           <w:p>
             <w:pPr/>
@@ -474,7 +474,7 @@
         </w:tc>
         <w:tc>
           <w:tcPr>
-            <w:tcW w:w="1916" w:type="dxa"/>
+            <w:tcW w:w="2340" w:type="dxa"/>
           </w:tcPr>
           <w:p>
             <w:pPr/>
@@ -502,7 +502,7 @@
         </w:tc>
         <w:tc>
           <w:tcPr>
-            <w:tcW w:w="3435" w:type="dxa"/>
+            <w:tcW w:w="3011" w:type="dxa"/>
           </w:tcPr>
           <w:p>
             <w:pPr/>
@@ -529,7 +529,7 @@
         </w:tc>
         <w:tc>
           <w:tcPr>
-            <w:tcW w:w="1916" w:type="dxa"/>
+            <w:tcW w:w="2340" w:type="dxa"/>
           </w:tcPr>
           <w:p>
             <w:pPr/>
@@ -557,7 +557,7 @@
         </w:tc>
         <w:tc>
           <w:tcPr>
-            <w:tcW w:w="3435" w:type="dxa"/>
+            <w:tcW w:w="3011" w:type="dxa"/>
           </w:tcPr>
           <w:p>
             <w:pPr/>
@@ -584,7 +584,7 @@
         </w:tc>
         <w:tc>
           <w:tcPr>
-            <w:tcW w:w="1916" w:type="dxa"/>
+            <w:tcW w:w="2340" w:type="dxa"/>
           </w:tcPr>
           <w:p>
             <w:pPr/>
@@ -615,7 +615,7 @@
         </w:tc>
         <w:tc>
           <w:tcPr>
-            <w:tcW w:w="3435" w:type="dxa"/>
+            <w:tcW w:w="3011" w:type="dxa"/>
           </w:tcPr>
           <w:p>
             <w:pPr/>
@@ -642,7 +642,7 @@
         </w:tc>
         <w:tc>
           <w:tcPr>
-            <w:tcW w:w="1916" w:type="dxa"/>
+            <w:tcW w:w="2340" w:type="dxa"/>
           </w:tcPr>
           <w:p>
             <w:pPr/>
@@ -670,7 +670,7 @@
         </w:tc>
         <w:tc>
           <w:tcPr>
-            <w:tcW w:w="3435" w:type="dxa"/>
+            <w:tcW w:w="3011" w:type="dxa"/>
           </w:tcPr>
           <w:p>
             <w:pPr/>
@@ -697,7 +697,7 @@
         </w:tc>
         <w:tc>
           <w:tcPr>
-            <w:tcW w:w="1916" w:type="dxa"/>
+            <w:tcW w:w="2340" w:type="dxa"/>
           </w:tcPr>
           <w:p>
             <w:pPr/>
@@ -728,7 +728,7 @@
         </w:tc>
         <w:tc>
           <w:tcPr>
-            <w:tcW w:w="3435" w:type="dxa"/>
+            <w:tcW w:w="3011" w:type="dxa"/>
           </w:tcPr>
           <w:p>
             <w:pPr/>
@@ -755,15 +755,15 @@
         </w:tc>
         <w:tc>
           <w:tcPr>
-            <w:tcW w:w="1916" w:type="dxa"/>
-          </w:tcPr>
-          <w:p>
-            <w:pPr/>
-            <w:r>
-              <w:rPr>
-                <w:rStyle w:val="CodeChar"/>
-              </w:rPr>
-              <w:t xml:space="preserve">Physician</w:t>
+            <w:tcW w:w="2340" w:type="dxa"/>
+          </w:tcPr>
+          <w:p>
+            <w:pPr/>
+            <w:r>
+              <w:rPr>
+                <w:rStyle w:val="CodeChar"/>
+              </w:rPr>
+              <w:t xml:space="preserve">IndividualPhysician</w:t>
             </w:r>
           </w:p>
         </w:tc>
@@ -783,7 +783,7 @@
         </w:tc>
         <w:tc>
           <w:tcPr>
-            <w:tcW w:w="3435" w:type="dxa"/>
+            <w:tcW w:w="3011" w:type="dxa"/>
           </w:tcPr>
           <w:p>
             <w:pPr/>
@@ -810,7 +810,7 @@
         </w:tc>
         <w:tc>
           <w:tcPr>
-            <w:tcW w:w="1916" w:type="dxa"/>
+            <w:tcW w:w="2340" w:type="dxa"/>
           </w:tcPr>
           <w:p>
             <w:pPr/>
@@ -838,7 +838,7 @@
         </w:tc>
         <w:tc>
           <w:tcPr>
-            <w:tcW w:w="3435" w:type="dxa"/>
+            <w:tcW w:w="3011" w:type="dxa"/>
           </w:tcPr>
           <w:p>
             <w:pPr/>
@@ -865,7 +865,7 @@
         </w:tc>
         <w:tc>
           <w:tcPr>
-            <w:tcW w:w="1916" w:type="dxa"/>
+            <w:tcW w:w="2340" w:type="dxa"/>
           </w:tcPr>
           <w:p>
             <w:pPr/>
@@ -893,7 +893,7 @@
         </w:tc>
         <w:tc>
           <w:tcPr>
-            <w:tcW w:w="3435" w:type="dxa"/>
+            <w:tcW w:w="3011" w:type="dxa"/>
           </w:tcPr>
           <w:p>
             <w:pPr/>
@@ -919,25 +919,16 @@
         <w:t xml:space="preserve">#localbusiness</w:t>
       </w:r>
       <w:r>
-        <w:t xml:space="preserve">, come indicato nelle slide 29-30 dell'audit Anni Azzurri. Le residenze hanno </w:t>
-      </w:r>
-      <w:r>
-        <w:rPr>
-          <w:rStyle w:val="CodeChar"/>
-        </w:rPr>
-        <w:t xml:space="preserve">@type</w:t>
-      </w:r>
-      <w:r>
-        <w:t xml:space="preserve"> </w:t>
-      </w:r>
-      <w:r>
-        <w:rPr>
-          <w:rStyle w:val="CodeChar"/>
-        </w:rPr>
-        <w:t xml:space="preserve">["NursingHome", "LocalBusiness"]</w:t>
-      </w:r>
-      <w:r>
-        <w:t xml:space="preserve">; cliniche, centri e ambulatori il sottotipo sanitario più specifico (</w:t>
+        <w:t xml:space="preserve">, come indicato nelle slide 29-30 dell'audit Anni Azzurri. Il tipo delle residenze si decide con l'agenzia prima dello sprint 3: schema.org non ha un tipo per le case di riposo, e la proposta è </w:t>
+      </w:r>
+      <w:r>
+        <w:rPr>
+          <w:rStyle w:val="CodeChar"/>
+        </w:rPr>
+        <w:t xml:space="preserve">["MedicalOrganization", "LocalBusiness"]</w:t>
+      </w:r>
+      <w:r>
+        <w:t xml:space="preserve">, che Google riconosce come attività locale. Cliniche, centri e ambulatori hanno il sottotipo sanitario più specifico (</w:t>
       </w:r>
       <w:r>
         <w:rPr>
@@ -955,7 +946,34 @@
         <w:t xml:space="preserve">Hospital</w:t>
       </w:r>
       <w:r>
-        <w:t xml:space="preserve">...).</w:t>
+        <w:t xml:space="preserve">...); i medici </w:t>
+      </w:r>
+      <w:r>
+        <w:rPr>
+          <w:rStyle w:val="CodeChar"/>
+        </w:rPr>
+        <w:t xml:space="preserve">IndividualPhysician</w:t>
+      </w:r>
+      <w:r>
+        <w:t xml:space="preserve">, con </w:t>
+      </w:r>
+      <w:r>
+        <w:rPr>
+          <w:rStyle w:val="CodeChar"/>
+        </w:rPr>
+        <w:t xml:space="preserve">practicesAt</w:t>
+      </w:r>
+      <w:r>
+        <w:t xml:space="preserve"> verso il </w:t>
+      </w:r>
+      <w:r>
+        <w:rPr>
+          <w:rStyle w:val="CodeChar"/>
+        </w:rPr>
+        <w:t xml:space="preserve">#localbusiness</w:t>
+      </w:r>
+      <w:r>
+        <w:t xml:space="preserve"> della struttura.</w:t>
       </w:r>
     </w:p>
     <w:p>

</xml_diff>

<commit_message>
AA-8 KOS-11 decisioni sul modello del grafo (29/10): tipo delle residenze, servizi senza sede, professionisti
Tipo delle residenze deciso dal progetto: [MedicalBusiness, MedicalOrganization] con Geriatric;
servizi senza sede come Service con provider; medici IndividualPhysician, altri professionisti Person;
abbinamento TuoTempo senza codice fiscale. Convenzione (scheda condivisa e docx), piano e CLAUDE.md aggiornati.

Co-Authored-By: Claude Opus 5.5 <noreply@anthropic.com>
Claude-Session: https://claude.ai/code/session_01Rr1X44gsg7BUwMzrRvYrc2
</commit_message>
<xml_diff>
--- a/docs/docx/convenzione-identificativi.docx
+++ b/docs/docx/convenzione-identificativi.docx
@@ -919,16 +919,115 @@
         <w:t xml:space="preserve">#localbusiness</w:t>
       </w:r>
       <w:r>
-        <w:t xml:space="preserve">, come indicato nelle slide 29-30 dell'audit Anni Azzurri. Il tipo delle residenze si decide con l'agenzia prima dello sprint 3: schema.org non ha un tipo per le case di riposo, e la proposta è </w:t>
-      </w:r>
-      <w:r>
-        <w:rPr>
-          <w:rStyle w:val="CodeChar"/>
-        </w:rPr>
-        <w:t xml:space="preserve">["MedicalOrganization", "LocalBusiness"]</w:t>
-      </w:r>
-      <w:r>
-        <w:t xml:space="preserve">, che Google riconosce come attività locale. Cliniche, centri e ambulatori hanno il sottotipo sanitario più specifico (</w:t>
+        <w:t xml:space="preserve">, come indicato nelle slide 29-30 dell'audit Anni Azzurri. Il nodo struttura si emette solo se la pagina ha l'indirizzo. Tipi (deciso il 29 ottobre 2026):</w:t>
+      </w:r>
+    </w:p>
+    <w:p>
+      <w:pPr>
+        <w:pStyle w:val="ListParagraph"/>
+        <w:numPr>
+          <w:ilvl w:val="0"/>
+          <w:numId w:val="3"/>
+        </w:numPr>
+      </w:pPr>
+      <w:r>
+        <w:rPr>
+          <w:b/>
+        </w:rPr>
+        <w:t xml:space="preserve">Residenze</w:t>
+      </w:r>
+      <w:r>
+        <w:t xml:space="preserve">: </w:t>
+      </w:r>
+      <w:r>
+        <w:rPr>
+          <w:rStyle w:val="CodeChar"/>
+        </w:rPr>
+        <w:t xml:space="preserve">["MedicalBusiness", "MedicalOrganization"]</w:t>
+      </w:r>
+      <w:r>
+        <w:t xml:space="preserve"> con </w:t>
+      </w:r>
+      <w:r>
+        <w:rPr>
+          <w:rStyle w:val="CodeChar"/>
+        </w:rPr>
+        <w:t xml:space="preserve">medicalSpecialty</w:t>
+      </w:r>
+      <w:r>
+        <w:t xml:space="preserve"> </w:t>
+      </w:r>
+      <w:r>
+        <w:rPr>
+          <w:rStyle w:val="CodeChar"/>
+        </w:rPr>
+        <w:t xml:space="preserve">Geriatric</w:t>
+      </w:r>
+      <w:r>
+        <w:t xml:space="preserve">. Schema.org non ha un tipo per le case di riposo (</w:t>
+      </w:r>
+      <w:r>
+        <w:rPr>
+          <w:rStyle w:val="CodeChar"/>
+        </w:rPr>
+        <w:t xml:space="preserve">NursingHome</w:t>
+      </w:r>
+      <w:r>
+        <w:t xml:space="preserve"> non esiste, verificato su schema.org 30.1): </w:t>
+      </w:r>
+      <w:r>
+        <w:rPr>
+          <w:rStyle w:val="CodeChar"/>
+        </w:rPr>
+        <w:t xml:space="preserve">MedicalBusiness</w:t>
+      </w:r>
+      <w:r>
+        <w:t xml:space="preserve"> è un sottotipo di </w:t>
+      </w:r>
+      <w:r>
+        <w:rPr>
+          <w:rStyle w:val="CodeChar"/>
+        </w:rPr>
+        <w:t xml:space="preserve">LocalBusiness</w:t>
+      </w:r>
+      <w:r>
+        <w:t xml:space="preserve">, come chiede l'audit Anni Azzurri (slide 30) e come richiede Google (il sottotipo più specifico), mentre </w:t>
+      </w:r>
+      <w:r>
+        <w:rPr>
+          <w:rStyle w:val="CodeChar"/>
+        </w:rPr>
+        <w:t xml:space="preserve">MedicalOrganization</w:t>
+      </w:r>
+      <w:r>
+        <w:t xml:space="preserve"> porta la specialità. Le residenze solo socio-assistenziali restano </w:t>
+      </w:r>
+      <w:r>
+        <w:rPr>
+          <w:rStyle w:val="CodeChar"/>
+        </w:rPr>
+        <w:t xml:space="preserve">LocalBusiness</w:t>
+      </w:r>
+      <w:r>
+        <w:t xml:space="preserve">.</w:t>
+      </w:r>
+    </w:p>
+    <w:p>
+      <w:pPr>
+        <w:pStyle w:val="ListParagraph"/>
+        <w:numPr>
+          <w:ilvl w:val="0"/>
+          <w:numId w:val="3"/>
+        </w:numPr>
+      </w:pPr>
+      <w:r>
+        <w:rPr>
+          <w:b/>
+        </w:rPr>
+        <w:t xml:space="preserve">Cliniche, centri e ambulatori</w:t>
+      </w:r>
+      <w:r>
+        <w:t xml:space="preserve">: il sottotipo sanitario più specifico (</w:t>
       </w:r>
       <w:r>
         <w:rPr>
@@ -946,7 +1045,88 @@
         <w:t xml:space="preserve">Hospital</w:t>
       </w:r>
       <w:r>
-        <w:t xml:space="preserve">...); i medici </w:t>
+        <w:t xml:space="preserve">...); un tipo che non è un'attività locale (es. </w:t>
+      </w:r>
+      <w:r>
+        <w:rPr>
+          <w:rStyle w:val="CodeChar"/>
+        </w:rPr>
+        <w:t xml:space="preserve">DiagnosticLab</w:t>
+      </w:r>
+      <w:r>
+        <w:t xml:space="preserve">) si affianca a </w:t>
+      </w:r>
+      <w:r>
+        <w:rPr>
+          <w:rStyle w:val="CodeChar"/>
+        </w:rPr>
+        <w:t xml:space="preserve">MedicalBusiness</w:t>
+      </w:r>
+      <w:r>
+        <w:t xml:space="preserve">.</w:t>
+      </w:r>
+    </w:p>
+    <w:p>
+      <w:pPr>
+        <w:pStyle w:val="ListParagraph"/>
+        <w:numPr>
+          <w:ilvl w:val="0"/>
+          <w:numId w:val="3"/>
+        </w:numPr>
+      </w:pPr>
+      <w:r>
+        <w:rPr>
+          <w:b/>
+        </w:rPr>
+        <w:t xml:space="preserve">Servizi senza sede propria</w:t>
+      </w:r>
+      <w:r>
+        <w:t xml:space="preserve"> (RSA Aperta, assistenza domiciliare): </w:t>
+      </w:r>
+      <w:r>
+        <w:rPr>
+          <w:rStyle w:val="CodeChar"/>
+        </w:rPr>
+        <w:t xml:space="preserve">Service</w:t>
+      </w:r>
+      <w:r>
+        <w:t xml:space="preserve"> con </w:t>
+      </w:r>
+      <w:r>
+        <w:rPr>
+          <w:rStyle w:val="CodeChar"/>
+        </w:rPr>
+        <w:t xml:space="preserve">provider</w:t>
+      </w:r>
+      <w:r>
+        <w:t xml:space="preserve"> verso il </w:t>
+      </w:r>
+      <w:r>
+        <w:rPr>
+          <w:rStyle w:val="CodeChar"/>
+        </w:rPr>
+        <w:t xml:space="preserve">#localbusiness</w:t>
+      </w:r>
+      <w:r>
+        <w:t xml:space="preserve"> della struttura che li eroga.</w:t>
+      </w:r>
+    </w:p>
+    <w:p>
+      <w:pPr>
+        <w:pStyle w:val="ListParagraph"/>
+        <w:numPr>
+          <w:ilvl w:val="0"/>
+          <w:numId w:val="3"/>
+        </w:numPr>
+      </w:pPr>
+      <w:r>
+        <w:rPr>
+          <w:b/>
+        </w:rPr>
+        <w:t xml:space="preserve">Medici</w:t>
+      </w:r>
+      <w:r>
+        <w:t xml:space="preserve">: </w:t>
       </w:r>
       <w:r>
         <w:rPr>
@@ -955,7 +1135,16 @@
         <w:t xml:space="preserve">IndividualPhysician</w:t>
       </w:r>
       <w:r>
-        <w:t xml:space="preserve">, con </w:t>
+        <w:t xml:space="preserve"> (sottotipo di </w:t>
+      </w:r>
+      <w:r>
+        <w:rPr>
+          <w:rStyle w:val="CodeChar"/>
+        </w:rPr>
+        <w:t xml:space="preserve">Physician</w:t>
+      </w:r>
+      <w:r>
+        <w:t xml:space="preserve">, il tipo dell'esempio dell'audit KosGroup, slide 27) con </w:t>
       </w:r>
       <w:r>
         <w:rPr>
@@ -973,7 +1162,25 @@
         <w:t xml:space="preserve">#localbusiness</w:t>
       </w:r>
       <w:r>
-        <w:t xml:space="preserve"> della struttura.</w:t>
+        <w:t xml:space="preserve"> della struttura; gli altri professionisti sanitari </w:t>
+      </w:r>
+      <w:r>
+        <w:rPr>
+          <w:rStyle w:val="CodeChar"/>
+        </w:rPr>
+        <w:t xml:space="preserve">Person</w:t>
+      </w:r>
+      <w:r>
+        <w:t xml:space="preserve"> con </w:t>
+      </w:r>
+      <w:r>
+        <w:rPr>
+          <w:rStyle w:val="CodeChar"/>
+        </w:rPr>
+        <w:t xml:space="preserve">jobTitle</w:t>
+      </w:r>
+      <w:r>
+        <w:t xml:space="preserve">.</w:t>
       </w:r>
     </w:p>
     <w:p>
@@ -1419,6 +1626,9 @@
     <w:abstractNumId w:val="0"/>
   </w:num>
   <w:num w:numId="2">
+    <w:abstractNumId w:val="0"/>
+  </w:num>
+  <w:num w:numId="3">
     <w:abstractNumId w:val="0"/>
   </w:num>
 </w:numbering>

</xml_diff>